<commit_message>
bch docs: cross-link the Genesys 2 harness to its Nexys A7 small profile
The small BCH(248,224) t=3 profile (BCH_PROFILE=small, 50 MHz, issue #82)
now appears where people look: UART_HARNESS.md gains a dedicated
small-profile section (build command, 50 MHz rationale, WNS/LUT numbers,
host geometry discovery) and drops the stale "no longer the target" /
"board validates only (4224,4120)" claims; the harness guide book ch01
and ch04 carry the same pointer and the regenerated PDF. RS-side
cross-links follow when #83 lands.
</commit_message>
<xml_diff>
--- a/projects/fpga-systems/Genesys2/ecc-ip/bch/docs/Binary_BCH_UART_Harness_v0.1.docx
+++ b/projects/fpga-systems/Genesys2/ecc-ip/bch/docs/Binary_BCH_UART_Harness_v0.1.docx
@@ -160,7 +160,7 @@
             </w:rPr>
             <w:fldChar w:fldCharType="separate"/>
           </w:r>
-          <w:hyperlink w:anchor="__RefHeading___Toc1637_2917605238">
+          <w:hyperlink w:anchor="__RefHeading___Toc1660_2359864596">
             <w:r>
               <w:rPr>
                 <w:webHidden/>
@@ -181,7 +181,7 @@
             </w:tabs>
             <w:rPr/>
           </w:pPr>
-          <w:hyperlink w:anchor="__RefHeading___Toc1639_2917605238">
+          <w:hyperlink w:anchor="__RefHeading___Toc1662_2359864596">
             <w:r>
               <w:rPr>
                 <w:webHidden/>
@@ -202,7 +202,7 @@
             </w:tabs>
             <w:rPr/>
           </w:pPr>
-          <w:hyperlink w:anchor="__RefHeading___Toc1641_2917605238">
+          <w:hyperlink w:anchor="__RefHeading___Toc1664_2359864596">
             <w:r>
               <w:rPr>
                 <w:webHidden/>
@@ -223,7 +223,7 @@
             </w:tabs>
             <w:rPr/>
           </w:pPr>
-          <w:hyperlink w:anchor="__RefHeading___Toc1643_2917605238">
+          <w:hyperlink w:anchor="__RefHeading___Toc1666_2359864596">
             <w:r>
               <w:rPr>
                 <w:webHidden/>
@@ -244,7 +244,7 @@
             </w:tabs>
             <w:rPr/>
           </w:pPr>
-          <w:hyperlink w:anchor="__RefHeading___Toc1645_2917605238">
+          <w:hyperlink w:anchor="__RefHeading___Toc1668_2359864596">
             <w:r>
               <w:rPr>
                 <w:webHidden/>
@@ -265,7 +265,7 @@
             </w:tabs>
             <w:rPr/>
           </w:pPr>
-          <w:hyperlink w:anchor="__RefHeading___Toc1647_2917605238">
+          <w:hyperlink w:anchor="__RefHeading___Toc1670_2359864596">
             <w:r>
               <w:rPr>
                 <w:webHidden/>
@@ -286,7 +286,7 @@
             </w:tabs>
             <w:rPr/>
           </w:pPr>
-          <w:hyperlink w:anchor="__RefHeading___Toc1649_2917605238">
+          <w:hyperlink w:anchor="__RefHeading___Toc1672_2359864596">
             <w:r>
               <w:rPr>
                 <w:webHidden/>
@@ -307,7 +307,7 @@
             </w:tabs>
             <w:rPr/>
           </w:pPr>
-          <w:hyperlink w:anchor="__RefHeading___Toc1651_2917605238">
+          <w:hyperlink w:anchor="__RefHeading___Toc1674_2359864596">
             <w:r>
               <w:rPr>
                 <w:webHidden/>
@@ -328,7 +328,7 @@
             </w:tabs>
             <w:rPr/>
           </w:pPr>
-          <w:hyperlink w:anchor="__RefHeading___Toc1653_2917605238">
+          <w:hyperlink w:anchor="__RefHeading___Toc1676_2359864596">
             <w:r>
               <w:rPr>
                 <w:webHidden/>
@@ -349,7 +349,7 @@
             </w:tabs>
             <w:rPr/>
           </w:pPr>
-          <w:hyperlink w:anchor="__RefHeading___Toc1655_2917605238">
+          <w:hyperlink w:anchor="__RefHeading___Toc1678_2359864596">
             <w:r>
               <w:rPr>
                 <w:webHidden/>
@@ -370,7 +370,7 @@
             </w:tabs>
             <w:rPr/>
           </w:pPr>
-          <w:hyperlink w:anchor="__RefHeading___Toc1657_2917605238">
+          <w:hyperlink w:anchor="__RefHeading___Toc1680_2359864596">
             <w:r>
               <w:rPr>
                 <w:webHidden/>
@@ -391,7 +391,7 @@
             </w:tabs>
             <w:rPr/>
           </w:pPr>
-          <w:hyperlink w:anchor="__RefHeading___Toc1659_2917605238">
+          <w:hyperlink w:anchor="__RefHeading___Toc1682_2359864596">
             <w:r>
               <w:rPr>
                 <w:webHidden/>
@@ -412,7 +412,7 @@
             </w:tabs>
             <w:rPr/>
           </w:pPr>
-          <w:hyperlink w:anchor="__RefHeading___Toc1661_2917605238">
+          <w:hyperlink w:anchor="__RefHeading___Toc1684_2359864596">
             <w:r>
               <w:rPr>
                 <w:webHidden/>
@@ -433,7 +433,7 @@
             </w:tabs>
             <w:rPr/>
           </w:pPr>
-          <w:hyperlink w:anchor="__RefHeading___Toc1663_2917605238">
+          <w:hyperlink w:anchor="__RefHeading___Toc1686_2359864596">
             <w:r>
               <w:rPr>
                 <w:webHidden/>
@@ -454,7 +454,7 @@
             </w:tabs>
             <w:rPr/>
           </w:pPr>
-          <w:hyperlink w:anchor="__RefHeading___Toc1665_2917605238">
+          <w:hyperlink w:anchor="__RefHeading___Toc1688_2359864596">
             <w:r>
               <w:rPr>
                 <w:webHidden/>
@@ -475,7 +475,7 @@
             </w:tabs>
             <w:rPr/>
           </w:pPr>
-          <w:hyperlink w:anchor="__RefHeading___Toc1667_2917605238">
+          <w:hyperlink w:anchor="__RefHeading___Toc1690_2359864596">
             <w:r>
               <w:rPr>
                 <w:webHidden/>
@@ -496,7 +496,7 @@
             </w:tabs>
             <w:rPr/>
           </w:pPr>
-          <w:hyperlink w:anchor="__RefHeading___Toc1669_2917605238">
+          <w:hyperlink w:anchor="__RefHeading___Toc1692_2359864596">
             <w:r>
               <w:rPr>
                 <w:webHidden/>
@@ -517,7 +517,7 @@
             </w:tabs>
             <w:rPr/>
           </w:pPr>
-          <w:hyperlink w:anchor="__RefHeading___Toc1671_2917605238">
+          <w:hyperlink w:anchor="__RefHeading___Toc1694_2359864596">
             <w:r>
               <w:rPr>
                 <w:webHidden/>
@@ -538,7 +538,7 @@
             </w:tabs>
             <w:rPr/>
           </w:pPr>
-          <w:hyperlink w:anchor="__RefHeading___Toc1673_2917605238">
+          <w:hyperlink w:anchor="__RefHeading___Toc1696_2359864596">
             <w:r>
               <w:rPr>
                 <w:webHidden/>
@@ -559,7 +559,7 @@
             </w:tabs>
             <w:rPr/>
           </w:pPr>
-          <w:hyperlink w:anchor="__RefHeading___Toc1675_2917605238">
+          <w:hyperlink w:anchor="__RefHeading___Toc1698_2359864596">
             <w:r>
               <w:rPr>
                 <w:webHidden/>
@@ -580,7 +580,7 @@
             </w:tabs>
             <w:rPr/>
           </w:pPr>
-          <w:hyperlink w:anchor="__RefHeading___Toc1677_2917605238">
+          <w:hyperlink w:anchor="__RefHeading___Toc1700_2359864596">
             <w:r>
               <w:rPr>
                 <w:webHidden/>
@@ -601,7 +601,7 @@
             </w:tabs>
             <w:rPr/>
           </w:pPr>
-          <w:hyperlink w:anchor="__RefHeading___Toc1679_2917605238">
+          <w:hyperlink w:anchor="__RefHeading___Toc1702_2359864596">
             <w:r>
               <w:rPr>
                 <w:webHidden/>
@@ -855,7 +855,7 @@
         <w:spacing w:before="360" w:after="120"/>
         <w:rPr/>
       </w:pPr>
-      <w:bookmarkStart w:id="0" w:name="__RefHeading___Toc1637_2917605238"/>
+      <w:bookmarkStart w:id="0" w:name="__RefHeading___Toc1660_2359864596"/>
       <w:bookmarkStart w:id="1" w:name="document-information"/>
       <w:bookmarkEnd w:id="0"/>
       <w:r>
@@ -887,7 +887,7 @@
         <w:spacing w:before="280" w:after="80"/>
         <w:rPr/>
       </w:pPr>
-      <w:bookmarkStart w:id="2" w:name="__RefHeading___Toc1639_2917605238"/>
+      <w:bookmarkStart w:id="2" w:name="__RefHeading___Toc1662_2359864596"/>
       <w:bookmarkEnd w:id="2"/>
       <w:r>
         <w:rPr>
@@ -1232,7 +1232,7 @@
       <w:r>
         <w:br w:type="page"/>
       </w:r>
-      <w:bookmarkStart w:id="5" w:name="__RefHeading___Toc1641_2917605238"/>
+      <w:bookmarkStart w:id="5" w:name="__RefHeading___Toc1664_2359864596"/>
       <w:bookmarkEnd w:id="5"/>
       <w:r>
         <w:rPr>
@@ -1277,7 +1277,7 @@
         <w:spacing w:before="280" w:after="80"/>
         <w:rPr/>
       </w:pPr>
-      <w:bookmarkStart w:id="6" w:name="__RefHeading___Toc1643_2917605238"/>
+      <w:bookmarkStart w:id="6" w:name="__RefHeading___Toc1666_2359864596"/>
       <w:bookmarkStart w:id="7" w:name="provenance"/>
       <w:bookmarkEnd w:id="6"/>
       <w:r>
@@ -1388,7 +1388,7 @@
         <w:spacing w:before="360" w:after="120"/>
         <w:rPr/>
       </w:pPr>
-      <w:bookmarkStart w:id="8" w:name="__RefHeading___Toc1645_2917605238"/>
+      <w:bookmarkStart w:id="8" w:name="__RefHeading___Toc1668_2359864596"/>
       <w:bookmarkStart w:id="9" w:name="purpose-and-geometry"/>
       <w:bookmarkEnd w:id="8"/>
       <w:r>
@@ -1600,7 +1600,20 @@
         <w:rPr>
           <w:sz w:val="20"/>
         </w:rPr>
-        <w:t xml:space="preserve"> as a build option, but the Genesys 2 is the primary target: the k325t-2 has the room and timing margin to hold the full BCH(4224,4120) loop at 100 MHz with both AXIS and AXI4 flavours, and both images came out timing-clean on the board build with positive slack. The Nexys flow is preserved so existing scripts do not break, but it is no longer the target for harness-class work.</w:t>
+        <w:t xml:space="preserve"> as a build option, and since 2026-10-07 the same tree carries a first-class small profile for it (issue #82): </w:t>
+      </w:r>
+      <w:r>
+        <w:rPr>
+          <w:rStyle w:val="VerbatimChar"/>
+          <w:sz w:val="20"/>
+        </w:rPr>
+        <w:t>BCH_PROFILE=small</w:t>
+      </w:r>
+      <w:r>
+        <w:rPr>
+          <w:sz w:val="20"/>
+        </w:rPr>
+        <w:t xml:space="preserve"> builds BCH(248,224) t=3 for the A7-100T at 50 MHz (WNS +7.8 ns, 38% LUT). The Genesys 2 remains the primary target for the full profile: the k325t-2 has the room and timing margin to hold the full BCH(4224,4120) loop at 100 MHz with both AXIS and AXI4 flavours, and both images came out timing-clean on the board build with positive slack.</w:t>
       </w:r>
     </w:p>
     <w:p>
@@ -1678,7 +1691,7 @@
         <w:spacing w:before="360" w:after="120"/>
         <w:rPr/>
       </w:pPr>
-      <w:bookmarkStart w:id="10" w:name="__RefHeading___Toc1647_2917605238"/>
+      <w:bookmarkStart w:id="10" w:name="__RefHeading___Toc1670_2359864596"/>
       <w:bookmarkEnd w:id="10"/>
       <w:r>
         <w:rPr>
@@ -1709,7 +1722,7 @@
         <w:spacing w:before="280" w:after="80"/>
         <w:rPr/>
       </w:pPr>
-      <w:bookmarkStart w:id="11" w:name="__RefHeading___Toc1649_2917605238"/>
+      <w:bookmarkStart w:id="11" w:name="__RefHeading___Toc1672_2359864596"/>
       <w:bookmarkEnd w:id="11"/>
       <w:r>
         <w:rPr>
@@ -3806,7 +3819,7 @@
       <w:r>
         <w:br w:type="page"/>
       </w:r>
-      <w:bookmarkStart w:id="13" w:name="__RefHeading___Toc1651_2917605238"/>
+      <w:bookmarkStart w:id="13" w:name="__RefHeading___Toc1674_2359864596"/>
       <w:bookmarkEnd w:id="13"/>
       <w:r>
         <w:rPr>
@@ -5289,7 +5302,7 @@
       <w:r>
         <w:br w:type="page"/>
       </w:r>
-      <w:bookmarkStart w:id="14" w:name="__RefHeading___Toc1653_2917605238"/>
+      <w:bookmarkStart w:id="14" w:name="__RefHeading___Toc1676_2359864596"/>
       <w:bookmarkEnd w:id="14"/>
       <w:r>
         <w:rPr>
@@ -6212,7 +6225,7 @@
       <w:r>
         <w:br w:type="page"/>
       </w:r>
-      <w:bookmarkStart w:id="16" w:name="__RefHeading___Toc1655_2917605238"/>
+      <w:bookmarkStart w:id="16" w:name="__RefHeading___Toc1678_2359864596"/>
       <w:bookmarkEnd w:id="16"/>
       <w:r>
         <w:rPr>
@@ -6243,7 +6256,7 @@
         <w:spacing w:before="280" w:after="80"/>
         <w:rPr/>
       </w:pPr>
-      <w:bookmarkStart w:id="17" w:name="__RefHeading___Toc1657_2917605238"/>
+      <w:bookmarkStart w:id="17" w:name="__RefHeading___Toc1680_2359864596"/>
       <w:bookmarkStart w:id="18" w:name="register-path"/>
       <w:bookmarkEnd w:id="17"/>
       <w:r>
@@ -6462,7 +6475,7 @@
         <w:spacing w:before="280" w:after="80"/>
         <w:rPr/>
       </w:pPr>
-      <w:bookmarkStart w:id="19" w:name="__RefHeading___Toc1659_2917605238"/>
+      <w:bookmarkStart w:id="19" w:name="__RefHeading___Toc1682_2359864596"/>
       <w:bookmarkStart w:id="20" w:name="axi4-flavour-datapath"/>
       <w:bookmarkEnd w:id="19"/>
       <w:r>
@@ -6566,7 +6579,7 @@
         <w:spacing w:before="280" w:after="80"/>
         <w:rPr/>
       </w:pPr>
-      <w:bookmarkStart w:id="22" w:name="__RefHeading___Toc1661_2917605238"/>
+      <w:bookmarkStart w:id="22" w:name="__RefHeading___Toc1684_2359864596"/>
       <w:bookmarkStart w:id="23" w:name="clock-and-reset"/>
       <w:bookmarkEnd w:id="22"/>
       <w:r>
@@ -6676,7 +6689,7 @@
         <w:spacing w:before="360" w:after="120"/>
         <w:rPr/>
       </w:pPr>
-      <w:bookmarkStart w:id="24" w:name="__RefHeading___Toc1663_2917605238"/>
+      <w:bookmarkStart w:id="24" w:name="__RefHeading___Toc1686_2359864596"/>
       <w:bookmarkStart w:id="25" w:name="the-fpga-testing-choices-and-why"/>
       <w:bookmarkEnd w:id="24"/>
       <w:r>
@@ -6708,7 +6721,7 @@
         <w:spacing w:before="280" w:after="80"/>
         <w:rPr/>
       </w:pPr>
-      <w:bookmarkStart w:id="26" w:name="__RefHeading___Toc1665_2917605238"/>
+      <w:bookmarkStart w:id="26" w:name="__RefHeading___Toc1688_2359864596"/>
       <w:bookmarkStart w:id="27" w:name="deterministic-campaigns"/>
       <w:bookmarkEnd w:id="26"/>
       <w:r>
@@ -6820,7 +6833,7 @@
         <w:spacing w:before="280" w:after="80"/>
         <w:rPr/>
       </w:pPr>
-      <w:bookmarkStart w:id="28" w:name="__RefHeading___Toc1667_2917605238"/>
+      <w:bookmarkStart w:id="28" w:name="__RefHeading___Toc1690_2359864596"/>
       <w:bookmarkStart w:id="29" w:name="X53a199f0e05baf626d45c0740703794633d0362"/>
       <w:bookmarkEnd w:id="28"/>
       <w:r>
@@ -6919,7 +6932,7 @@
         <w:spacing w:before="280" w:after="80"/>
         <w:rPr/>
       </w:pPr>
-      <w:bookmarkStart w:id="30" w:name="__RefHeading___Toc1669_2917605238"/>
+      <w:bookmarkStart w:id="30" w:name="__RefHeading___Toc1692_2359864596"/>
       <w:bookmarkStart w:id="31" w:name="X33425c8a372d93eb7f1a792208a4c72a5622771"/>
       <w:bookmarkEnd w:id="30"/>
       <w:r>
@@ -6979,7 +6992,7 @@
         <w:spacing w:before="280" w:after="80"/>
         <w:rPr/>
       </w:pPr>
-      <w:bookmarkStart w:id="32" w:name="__RefHeading___Toc1671_2917605238"/>
+      <w:bookmarkStart w:id="32" w:name="__RefHeading___Toc1694_2359864596"/>
       <w:bookmarkStart w:id="33" w:name="X28597d5f952d8edbf8e0506b6bb6ce9edca9d3e"/>
       <w:bookmarkEnd w:id="32"/>
       <w:r>
@@ -7052,7 +7065,7 @@
         <w:spacing w:before="280" w:after="80"/>
         <w:rPr/>
       </w:pPr>
-      <w:bookmarkStart w:id="34" w:name="__RefHeading___Toc1673_2917605238"/>
+      <w:bookmarkStart w:id="34" w:name="__RefHeading___Toc1696_2359864596"/>
       <w:bookmarkStart w:id="35" w:name="X0c98aa677c1a3dce27fae4ce98d2159186982bf"/>
       <w:bookmarkEnd w:id="34"/>
       <w:r>
@@ -7164,7 +7177,7 @@
         <w:spacing w:before="280" w:after="80"/>
         <w:rPr/>
       </w:pPr>
-      <w:bookmarkStart w:id="36" w:name="__RefHeading___Toc1675_2917605238"/>
+      <w:bookmarkStart w:id="36" w:name="__RefHeading___Toc1698_2359864596"/>
       <w:bookmarkStart w:id="37" w:name="Xeb2c1eca342142d59e7b837f5707d394fe730c6"/>
       <w:bookmarkEnd w:id="36"/>
       <w:r>
@@ -7236,7 +7249,7 @@
         <w:spacing w:before="360" w:after="120"/>
         <w:rPr/>
       </w:pPr>
-      <w:bookmarkStart w:id="38" w:name="__RefHeading___Toc1677_2917605238"/>
+      <w:bookmarkStart w:id="38" w:name="__RefHeading___Toc1700_2359864596"/>
       <w:bookmarkStart w:id="39" w:name="operating-it"/>
       <w:bookmarkEnd w:id="38"/>
       <w:r>
@@ -7287,7 +7300,7 @@
           <w:rStyle w:val="VerbatimChar"/>
           <w:sz w:val="20"/>
         </w:rPr>
-        <w:t>projects/fpga-systems/Genesys2/bch/</w:t>
+        <w:t>projects/fpga-systems/Genesys2/ecc-ip/bch/</w:t>
       </w:r>
       <w:r>
         <w:rPr>
@@ -7366,6 +7379,44 @@
     <w:p>
       <w:pPr>
         <w:pStyle w:val="FirstParagraph"/>
+        <w:rPr/>
+      </w:pPr>
+      <w:r>
+        <w:rPr>
+          <w:sz w:val="20"/>
+        </w:rPr>
+        <w:t xml:space="preserve">For the Nexys A7 small profile, build the bitstream with </w:t>
+      </w:r>
+      <w:r>
+        <w:rPr>
+          <w:rStyle w:val="VerbatimChar"/>
+          <w:sz w:val="20"/>
+        </w:rPr>
+        <w:t>make -C build-loop bitstream BCH_TARGET=nexys_a7_100t BCH_PROFILE=small</w:t>
+      </w:r>
+      <w:r>
+        <w:rPr>
+          <w:sz w:val="20"/>
+        </w:rPr>
+        <w:t xml:space="preserve"> and drive the same sequences over the A7’s UART; </w:t>
+      </w:r>
+      <w:r>
+        <w:rPr>
+          <w:rStyle w:val="VerbatimChar"/>
+          <w:sz w:val="20"/>
+        </w:rPr>
+        <w:t>init</w:t>
+      </w:r>
+      <w:r>
+        <w:rPr>
+          <w:sz w:val="20"/>
+        </w:rPr>
+        <w:t xml:space="preserve"> proves the “BCHS” BUILD_ID and the PROFILE CSR reports n=248, t=3, so the host programs pick up the geometry from the board.</w:t>
+      </w:r>
+    </w:p>
+    <w:p>
+      <w:pPr>
+        <w:pStyle w:val="BodyText"/>
         <w:rPr/>
       </w:pPr>
       <w:r>
@@ -7504,7 +7555,7 @@
         <w:spacing w:before="360" w:after="120"/>
         <w:rPr/>
       </w:pPr>
-      <w:bookmarkStart w:id="40" w:name="__RefHeading___Toc1679_2917605238"/>
+      <w:bookmarkStart w:id="40" w:name="__RefHeading___Toc1702_2359864596"/>
       <w:bookmarkStart w:id="41" w:name="what-is-deliberately-not-board-tested"/>
       <w:bookmarkEnd w:id="40"/>
       <w:r>

</xml_diff>